<commit_message>
Minor Format Changes PKM-KC
</commit_message>
<xml_diff>
--- a/PKM-KC Group1.docx
+++ b/PKM-KC Group1.docx
@@ -5095,7 +5095,7 @@
           <w:i/>
           <w:iCs/>
         </w:rPr>
-        <w:t xml:space="preserve"> waterfall </w:t>
+        <w:t xml:space="preserve">waterfall </w:t>
       </w:r>
       <w:r>
         <w:t xml:space="preserve">yang mengandalkan alur kerja linier berurutan. Sebagai bukti penerapan praktisnya, pengembangan aplikasi belanja daring pada CV Widi Agro terbukti berhasil distrukturkan menggunakan </w:t>
@@ -11018,7 +11018,7 @@
                 <w:szCs w:val="18"/>
                 <w:lang w:val="en-ID"/>
               </w:rPr>
-              <w:t xml:space="preserve"> available</w:t>
+              <w:t>available</w:t>
             </w:r>
           </w:p>
         </w:tc>
@@ -41899,7 +41899,7 @@
               </wp:anchor>
             </w:drawing>
           </mc:Choice>
-          <mc:Fallback xmlns:a="http://schemas.openxmlformats.org/drawingml/2006/main" xmlns:pic="http://schemas.openxmlformats.org/drawingml/2006/picture" xmlns:a14="http://schemas.microsoft.com/office/drawing/2010/main" xmlns:arto="http://schemas.microsoft.com/office/word/2006/arto">
+          <mc:Fallback xmlns:arto="http://schemas.microsoft.com/office/word/2006/arto" xmlns:a14="http://schemas.microsoft.com/office/drawing/2010/main" xmlns:pic="http://schemas.openxmlformats.org/drawingml/2006/picture" xmlns:a="http://schemas.openxmlformats.org/drawingml/2006/main">
             <w:pict w14:anchorId="514AB021">
               <v:line id="Straight Connector 1" style="position:absolute;z-index:251659264;visibility:visible;mso-wrap-style:square;mso-wrap-distance-left:9pt;mso-wrap-distance-top:0;mso-wrap-distance-right:9pt;mso-wrap-distance-bottom:0;mso-position-horizontal:absolute;mso-position-horizontal-relative:text;mso-position-vertical:absolute;mso-position-vertical-relative:text" o:spid="_x0000_s1026" strokecolor="black [3213]" strokeweight="2pt" from="0,3.4pt" to="396pt,3.4pt" w14:anchorId="7E9B78EC" o:gfxdata="UEsDBBQABgAIAAAAIQC2gziS/gAAAOEBAAATAAAAW0NvbnRlbnRfVHlwZXNdLnhtbJSRQU7DMBBF 90jcwfIWJU67QAgl6YK0S0CoHGBkTxKLZGx5TGhvj5O2G0SRWNoz/78nu9wcxkFMGNg6quQqL6RA 0s5Y6ir5vt9lD1JwBDIwOMJKHpHlpr69KfdHjyxSmriSfYz+USnWPY7AufNIadK6MEJMx9ApD/oD OlTrorhX2lFEilmcO2RdNtjC5xDF9pCuTyYBB5bi6bQ4syoJ3g9WQ0ymaiLzg5KdCXlKLjvcW893 SUOqXwnz5DrgnHtJTxOsQfEKIT7DmDSUCaxw7Rqn8787ZsmRM9e2VmPeBN4uqYvTtW7jvijg9N/y JsXecLq0q+WD6m8AAAD//wMAUEsDBBQABgAIAAAAIQA4/SH/1gAAAJQBAAALAAAAX3JlbHMvLnJl bHOkkMFqwzAMhu+DvYPRfXGawxijTi+j0GvpHsDYimMaW0Yy2fr2M4PBMnrbUb/Q94l/f/hMi1qR JVI2sOt6UJgd+ZiDgffL8ekFlFSbvV0oo4EbChzGx4f9GRdb25HMsYhqlCwG5lrLq9biZkxWOiqY 22YiTra2kYMu1l1tQD30/bPm3wwYN0x18gb45AdQl1tp5j/sFB2T0FQ7R0nTNEV3j6o9feQzro1i OWA14Fm+Q8a1a8+Bvu/d/dMb2JY5uiPbhG/ktn4cqGU/er3pcvwCAAD//wMAUEsDBBQABgAIAAAA IQCJ+fkGswEAANQDAAAOAAAAZHJzL2Uyb0RvYy54bWysU01v2zAMvQ/ofxB0b+QE6NAZcXpo0V6G rdjHD1BlKhYgiYKkxc6/L6UkdrENKDDsQosS3yP5SG/vJmfZAWIy6Du+XjWcgVfYG7/v+M8fj9e3 nKUsfS8teuj4ERK/21192I6hhQ0OaHuIjEh8asfQ8SHn0AqR1ABOphUG8PSoMTqZyY170Uc5Eruz YtM0H8WIsQ8RFaREtw+nR76r/FqDyl+1TpCZ7TjVlquN1b4UK3Zb2e6jDINR5zLkP1ThpPGUdKZ6 kFmyX9H8QeWMiphQ55VCJ1Bro6D2QN2sm9+6+T7IALUXEieFWab0/2jVl8O9f44kwxhSm8JzLF1M OrrypfrYVMU6zmLBlJmiy5tm84kmwJm6vIkFGGLKT4COlUPHrfGlD9nKw+eUKRmFXkLKtfXFJrSm fzTWVqdsANzbyA6SZpendZkV4d5EkVeQYim9nvLRwon1G2hmeip2U7PXrVo4pVLg84XXeoouME0V zMDmfeA5vkChbtwMXr8PnhE1M/o8g53xGP9GsEihT/EXBU59FwlesD/WoVZpaHWqcuc1L7v51q/w 5WfcvQIAAP//AwBQSwMEFAAGAAgAAAAhAMA6d/XaAAAABAEAAA8AAABkcnMvZG93bnJldi54bWxM j8tOwzAQRfdI/QdrKrGjTosoEOJUCMSiC4QIVcvSjYckxR5HsfPg7xnYwPLoju49k20mZ8WAXWg8 KVguEhBIpTcNVQp2b08XNyBC1GS09YQKvjDAJp+dZTo1fqRXHIpYCS6hkGoFdYxtKmUoa3Q6LHyL xNmH75yOjF0lTadHLndWrpJkLZ1uiBdq3eJDjeVn0TsFdjc8Xm2fi7B/uTwV9rC17/1olTqfT/d3 ICJO8e8YfvRZHXJ2OvqeTBBWAT8SFaxZn8Pr2xXz8Zdlnsn/8vk3AAAA//8DAFBLAQItABQABgAI AAAAIQC2gziS/gAAAOEBAAATAAAAAAAAAAAAAAAAAAAAAABbQ29udGVudF9UeXBlc10ueG1sUEsB Ai0AFAAGAAgAAAAhADj9If/WAAAAlAEAAAsAAAAAAAAAAAAAAAAALwEAAF9yZWxzLy5yZWxzUEsB Ai0AFAAGAAgAAAAhAIn5+QazAQAA1AMAAA4AAAAAAAAAAAAAAAAALgIAAGRycy9lMm9Eb2MueG1s UEsBAi0AFAAGAAgAAAAhAMA6d/XaAAAABAEAAA8AAAAAAAAAAAAAAAAADQQAAGRycy9kb3ducmV2 LnhtbFBLBQYAAAAABAAEAPMAAAAUBQAAAAA= ">
                 <v:shadow on="t" color="black" opacity="24903f" offset="0,.55556mm" origin=",.5"/>
@@ -48524,6 +48524,7 @@
   <w:style w:type="character" w:default="1" w:styleId="DefaultParagraphFont">
     <w:name w:val="Default Paragraph Font"/>
     <w:uiPriority w:val="1"/>
+    <w:semiHidden/>
     <w:unhideWhenUsed/>
   </w:style>
   <w:style w:type="table" w:default="1" w:styleId="TableNormal">
@@ -49572,32 +49573,15 @@
 </file>
 
 <file path=customXml/item2.xml><?xml version="1.0" encoding="utf-8"?>
-<p:properties xmlns:p="http://schemas.microsoft.com/office/2006/metadata/properties" xmlns:xsi="http://www.w3.org/2001/XMLSchema-instance" xmlns:pc="http://schemas.microsoft.com/office/infopath/2007/PartnerControls">
-  <documentManagement>
-    <Description0 xmlns="957be609-606c-4573-8e83-b3345b133b7f" xsi:nil="true"/>
-    <Effective_x0020_Date xmlns="957be609-606c-4573-8e83-b3345b133b7f">2022-03-09T09:03:26+00:00</Effective_x0020_Date>
-    <TaxCatchAll xmlns="d7ddc200-317b-47f8-84b9-3717c6f809b1" xsi:nil="true"/>
-    <n048e479b5714f6f9cda1b9c9dc1e4b8 xmlns="957be609-606c-4573-8e83-b3345b133b7f">
-      <Terms xmlns="http://schemas.microsoft.com/office/infopath/2007/PartnerControls"/>
-    </n048e479b5714f6f9cda1b9c9dc1e4b8>
-    <_dlc_DocId xmlns="d7ddc200-317b-47f8-84b9-3717c6f809b1">VXNNU6T4TQ6A-1760508494-290023</_dlc_DocId>
-    <_dlc_DocIdUrl xmlns="d7ddc200-317b-47f8-84b9-3717c6f809b1">
-      <Url>https://binusianorg.sharepoint.com/resources/_layouts/15/DocIdRedir.aspx?ID=VXNNU6T4TQ6A-1760508494-290023</Url>
-      <Description>VXNNU6T4TQ6A-1760508494-290023</Description>
-    </_dlc_DocIdUrl>
-    <lcf76f155ced4ddcb4097134ff3c332f xmlns="957be609-606c-4573-8e83-b3345b133b7f">
-      <Terms xmlns="http://schemas.microsoft.com/office/infopath/2007/PartnerControls"/>
-    </lcf76f155ced4ddcb4097134ff3c332f>
-    <_Flow_SignoffStatus xmlns="957be609-606c-4573-8e83-b3345b133b7f" xsi:nil="true"/>
-  </documentManagement>
-</p:properties>
+<?mso-contentType ?>
+<FormTemplates xmlns="http://schemas.microsoft.com/sharepoint/v3/contenttype/forms">
+  <Display>DocumentLibraryForm</Display>
+  <Edit>DocumentLibraryForm</Edit>
+  <New>DocumentLibraryForm</New>
+</FormTemplates>
 </file>
 
 <file path=customXml/item3.xml><?xml version="1.0" encoding="utf-8"?>
-<b:Sources xmlns:b="http://schemas.openxmlformats.org/officeDocument/2006/bibliography" xmlns="http://schemas.openxmlformats.org/officeDocument/2006/bibliography" SelectedStyle="\APASixthEditionOfficeOnline.xsl" StyleName="APA" Version="6"/>
-</file>
-
-<file path=customXml/item4.xml><?xml version="1.0" encoding="utf-8"?>
 <ct:contentTypeSchema xmlns:ct="http://schemas.microsoft.com/office/2006/metadata/contentType" xmlns:ma="http://schemas.microsoft.com/office/2006/metadata/properties/metaAttributes" ct:_="" ma:_="" ma:contentTypeName="Document" ma:contentTypeID="0x010100C3644C76865ED644BFFD68DED16A917F" ma:contentTypeVersion="45" ma:contentTypeDescription="Create a new document." ma:contentTypeScope="" ma:versionID="818c045dc426c594577378cd1702d361">
   <xsd:schema xmlns:xsd="http://www.w3.org/2001/XMLSchema" xmlns:xs="http://www.w3.org/2001/XMLSchema" xmlns:p="http://schemas.microsoft.com/office/2006/metadata/properties" xmlns:ns2="d7ddc200-317b-47f8-84b9-3717c6f809b1" xmlns:ns3="957be609-606c-4573-8e83-b3345b133b7f" targetNamespace="http://schemas.microsoft.com/office/2006/metadata/properties" ma:root="true" ma:fieldsID="e9ee70b3cd76711ef8b830a8210d4924" ns2:_="" ns3:_="">
     <xsd:import namespace="d7ddc200-317b-47f8-84b9-3717c6f809b1"/>
@@ -49905,13 +49889,30 @@
 </ct:contentTypeSchema>
 </file>
 
+<file path=customXml/item4.xml><?xml version="1.0" encoding="utf-8"?>
+<b:Sources xmlns:b="http://schemas.openxmlformats.org/officeDocument/2006/bibliography" xmlns="http://schemas.openxmlformats.org/officeDocument/2006/bibliography" SelectedStyle="\APASixthEditionOfficeOnline.xsl" StyleName="APA" Version="6"/>
+</file>
+
 <file path=customXml/item5.xml><?xml version="1.0" encoding="utf-8"?>
-<?mso-contentType ?>
-<FormTemplates xmlns="http://schemas.microsoft.com/sharepoint/v3/contenttype/forms">
-  <Display>DocumentLibraryForm</Display>
-  <Edit>DocumentLibraryForm</Edit>
-  <New>DocumentLibraryForm</New>
-</FormTemplates>
+<p:properties xmlns:p="http://schemas.microsoft.com/office/2006/metadata/properties" xmlns:xsi="http://www.w3.org/2001/XMLSchema-instance" xmlns:pc="http://schemas.microsoft.com/office/infopath/2007/PartnerControls">
+  <documentManagement>
+    <Description0 xmlns="957be609-606c-4573-8e83-b3345b133b7f" xsi:nil="true"/>
+    <Effective_x0020_Date xmlns="957be609-606c-4573-8e83-b3345b133b7f">2022-03-09T09:03:26+00:00</Effective_x0020_Date>
+    <TaxCatchAll xmlns="d7ddc200-317b-47f8-84b9-3717c6f809b1" xsi:nil="true"/>
+    <n048e479b5714f6f9cda1b9c9dc1e4b8 xmlns="957be609-606c-4573-8e83-b3345b133b7f">
+      <Terms xmlns="http://schemas.microsoft.com/office/infopath/2007/PartnerControls"/>
+    </n048e479b5714f6f9cda1b9c9dc1e4b8>
+    <_dlc_DocId xmlns="d7ddc200-317b-47f8-84b9-3717c6f809b1">VXNNU6T4TQ6A-1760508494-290023</_dlc_DocId>
+    <_dlc_DocIdUrl xmlns="d7ddc200-317b-47f8-84b9-3717c6f809b1">
+      <Url>https://binusianorg.sharepoint.com/resources/_layouts/15/DocIdRedir.aspx?ID=VXNNU6T4TQ6A-1760508494-290023</Url>
+      <Description>VXNNU6T4TQ6A-1760508494-290023</Description>
+    </_dlc_DocIdUrl>
+    <lcf76f155ced4ddcb4097134ff3c332f xmlns="957be609-606c-4573-8e83-b3345b133b7f">
+      <Terms xmlns="http://schemas.microsoft.com/office/infopath/2007/PartnerControls"/>
+    </lcf76f155ced4ddcb4097134ff3c332f>
+    <_Flow_SignoffStatus xmlns="957be609-606c-4573-8e83-b3345b133b7f" xsi:nil="true"/>
+  </documentManagement>
+</p:properties>
 </file>
 
 <file path=customXml/itemProps1.xml><?xml version="1.0" encoding="utf-8"?>
@@ -49923,25 +49924,14 @@
 </file>
 
 <file path=customXml/itemProps2.xml><?xml version="1.0" encoding="utf-8"?>
-<ds:datastoreItem xmlns:ds="http://schemas.openxmlformats.org/officeDocument/2006/customXml" ds:itemID="{EF7E26E1-597A-46AB-8C46-0EFE1EA8ADA7}">
+<ds:datastoreItem xmlns:ds="http://schemas.openxmlformats.org/officeDocument/2006/customXml" ds:itemID="{2C796862-744B-48C6-B889-3E4B0E4245E1}">
   <ds:schemaRefs>
-    <ds:schemaRef ds:uri="http://schemas.microsoft.com/office/2006/metadata/properties"/>
-    <ds:schemaRef ds:uri="http://schemas.microsoft.com/office/infopath/2007/PartnerControls"/>
-    <ds:schemaRef ds:uri="957be609-606c-4573-8e83-b3345b133b7f"/>
-    <ds:schemaRef ds:uri="d7ddc200-317b-47f8-84b9-3717c6f809b1"/>
+    <ds:schemaRef ds:uri="http://schemas.microsoft.com/sharepoint/v3/contenttype/forms"/>
   </ds:schemaRefs>
 </ds:datastoreItem>
 </file>
 
 <file path=customXml/itemProps3.xml><?xml version="1.0" encoding="utf-8"?>
-<ds:datastoreItem xmlns:ds="http://schemas.openxmlformats.org/officeDocument/2006/customXml" ds:itemID="{E72A28E8-C347-444C-AF77-62F4CF754496}">
-  <ds:schemaRefs>
-    <ds:schemaRef ds:uri="http://schemas.openxmlformats.org/officeDocument/2006/bibliography"/>
-  </ds:schemaRefs>
-</ds:datastoreItem>
-</file>
-
-<file path=customXml/itemProps4.xml><?xml version="1.0" encoding="utf-8"?>
 <ds:datastoreItem xmlns:ds="http://schemas.openxmlformats.org/officeDocument/2006/customXml" ds:itemID="{1C9693F0-B1A1-4DA3-8717-A05C26384323}">
   <ds:schemaRefs>
     <ds:schemaRef ds:uri="http://schemas.microsoft.com/office/2006/metadata/contentType"/>
@@ -49960,10 +49950,21 @@
 </ds:datastoreItem>
 </file>
 
+<file path=customXml/itemProps4.xml><?xml version="1.0" encoding="utf-8"?>
+<ds:datastoreItem xmlns:ds="http://schemas.openxmlformats.org/officeDocument/2006/customXml" ds:itemID="{E72A28E8-C347-444C-AF77-62F4CF754496}">
+  <ds:schemaRefs>
+    <ds:schemaRef ds:uri="http://schemas.openxmlformats.org/officeDocument/2006/bibliography"/>
+  </ds:schemaRefs>
+</ds:datastoreItem>
+</file>
+
 <file path=customXml/itemProps5.xml><?xml version="1.0" encoding="utf-8"?>
-<ds:datastoreItem xmlns:ds="http://schemas.openxmlformats.org/officeDocument/2006/customXml" ds:itemID="{2C796862-744B-48C6-B889-3E4B0E4245E1}">
+<ds:datastoreItem xmlns:ds="http://schemas.openxmlformats.org/officeDocument/2006/customXml" ds:itemID="{EF7E26E1-597A-46AB-8C46-0EFE1EA8ADA7}">
   <ds:schemaRefs>
-    <ds:schemaRef ds:uri="http://schemas.microsoft.com/sharepoint/v3/contenttype/forms"/>
+    <ds:schemaRef ds:uri="http://schemas.microsoft.com/office/2006/metadata/properties"/>
+    <ds:schemaRef ds:uri="http://schemas.microsoft.com/office/infopath/2007/PartnerControls"/>
+    <ds:schemaRef ds:uri="957be609-606c-4573-8e83-b3345b133b7f"/>
+    <ds:schemaRef ds:uri="d7ddc200-317b-47f8-84b9-3717c6f809b1"/>
   </ds:schemaRefs>
 </ds:datastoreItem>
 </file>
</xml_diff>